<commit_message>
added the docx for missing and repeated values of the grid problem
</commit_message>
<xml_diff>
--- a/Array part 1 docx/Majority element.docx
+++ b/Array part 1 docx/Majority element.docx
@@ -18,30 +18,58 @@
       </w:r>
     </w:p>
     <w:p>
-      <w:r>
-        <w:pict w14:anchorId="4610AD33">
-          <v:rect id="_x0000_i1151" style="width:0;height:1.5pt" o:hralign="center" o:hrstd="t" o:hrnoshade="t" o:hr="t" fillcolor="gray" stroked="f"/>
-        </w:pict>
-      </w:r>
-    </w:p>
-    <w:p>
       <w:pPr>
         <w:rPr>
           <w:b/>
           <w:bCs/>
         </w:rPr>
       </w:pPr>
-      <w:r>
+      <w:hyperlink r:id="rId5" w:history="1">
+        <w:r>
+          <w:rPr>
+            <w:rStyle w:val="Hyperlink"/>
+            <w:b/>
+            <w:bCs/>
+          </w:rPr>
+          <w:t xml:space="preserve">Majority Element - </w:t>
+        </w:r>
+        <w:proofErr w:type="spellStart"/>
+        <w:r>
+          <w:rPr>
+            <w:rStyle w:val="Hyperlink"/>
+            <w:b/>
+            <w:bCs/>
+          </w:rPr>
+          <w:t>LeetCode</w:t>
+        </w:r>
+        <w:proofErr w:type="spellEnd"/>
+      </w:hyperlink>
+    </w:p>
+    <w:p>
+      <w:r>
+        <w:pict w14:anchorId="4610AD33">
+          <v:rect id="_x0000_i1025" style="width:0;height:1.5pt" o:hralign="center" o:hrstd="t" o:hrnoshade="t" o:hr="t" fillcolor="gray" stroked="f"/>
+        </w:pict>
+      </w:r>
+    </w:p>
+    <w:p>
+      <w:pPr>
         <w:rPr>
           <w:b/>
           <w:bCs/>
         </w:rPr>
+      </w:pPr>
+      <w:r>
+        <w:rPr>
+          <w:b/>
+          <w:bCs/>
+        </w:rPr>
         <w:t>1. Problem Statement &amp; Constraints</w:t>
       </w:r>
     </w:p>
     <w:p>
       <w:r>
-        <w:t xml:space="preserve">You are given an array of size $n$. Your goal is to find the </w:t>
+        <w:t xml:space="preserve">You are given an array of size n. Your goal is to find the </w:t>
       </w:r>
       <w:r>
         <w:rPr>
@@ -99,7 +127,7 @@
     <w:p>
       <w:r>
         <w:pict w14:anchorId="08D1502D">
-          <v:rect id="_x0000_i1152" style="width:0;height:1.5pt" o:hralign="center" o:hrstd="t" o:hrnoshade="t" o:hr="t" fillcolor="gray" stroked="f"/>
+          <v:rect id="_x0000_i1026" style="width:0;height:1.5pt" o:hralign="center" o:hrstd="t" o:hrnoshade="t" o:hr="t" fillcolor="gray" stroked="f"/>
         </w:pict>
       </w:r>
     </w:p>
@@ -290,7 +318,7 @@
     <w:p>
       <w:r>
         <w:pict w14:anchorId="60FD8F3C">
-          <v:rect id="_x0000_i1153" style="width:0;height:1.5pt" o:hralign="center" o:hrstd="t" o:hrnoshade="t" o:hr="t" fillcolor="gray" stroked="f"/>
+          <v:rect id="_x0000_i1027" style="width:0;height:1.5pt" o:hralign="center" o:hrstd="t" o:hrnoshade="t" o:hr="t" fillcolor="gray" stroked="f"/>
         </w:pict>
       </w:r>
     </w:p>
@@ -330,7 +358,6 @@
           <w:b/>
           <w:bCs/>
         </w:rPr>
-        <w:lastRenderedPageBreak/>
         <w:t>3. Approach 2: Moore’s Voting Algorithm (The Optimal Way)</w:t>
       </w:r>
     </w:p>
@@ -554,7 +581,7 @@
     <w:p>
       <w:r>
         <w:pict w14:anchorId="7A6CD62C">
-          <v:rect id="_x0000_i1154" style="width:0;height:1.5pt" o:hralign="center" o:hrstd="t" o:hrnoshade="t" o:hr="t" fillcolor="gray" stroked="f"/>
+          <v:rect id="_x0000_i1028" style="width:0;height:1.5pt" o:hralign="center" o:hrstd="t" o:hrnoshade="t" o:hr="t" fillcolor="gray" stroked="f"/>
         </w:pict>
       </w:r>
     </w:p>
@@ -3081,6 +3108,29 @@
       <w:spacing w:val="5"/>
     </w:rPr>
   </w:style>
+  <w:style w:type="character" w:styleId="Hyperlink">
+    <w:name w:val="Hyperlink"/>
+    <w:basedOn w:val="DefaultParagraphFont"/>
+    <w:uiPriority w:val="99"/>
+    <w:unhideWhenUsed/>
+    <w:rsid w:val="009A43ED"/>
+    <w:rPr>
+      <w:color w:val="0563C1" w:themeColor="hyperlink"/>
+      <w:u w:val="single"/>
+    </w:rPr>
+  </w:style>
+  <w:style w:type="character" w:styleId="UnresolvedMention">
+    <w:name w:val="Unresolved Mention"/>
+    <w:basedOn w:val="DefaultParagraphFont"/>
+    <w:uiPriority w:val="99"/>
+    <w:semiHidden/>
+    <w:unhideWhenUsed/>
+    <w:rsid w:val="009A43ED"/>
+    <w:rPr>
+      <w:color w:val="605E5C"/>
+      <w:shd w:val="clear" w:color="auto" w:fill="E1DFDD"/>
+    </w:rPr>
+  </w:style>
 </w:styles>
 </file>
 

</xml_diff>